<commit_message>
Stats band + CV: add 3 new delivery metrics (registers, models, drawings)
Website:
- Stats band restructured into TWO rows separated by a horizontal divider:
  * Top row (4 stats): scope/experience - Years, Mega Projects, m² Coordinated, BIM Tools
  * Bottom row (3 stats): delivery output - Asset & COBie Registers, Models Coordinated, IFC & Shop Drawings
- Mega Projects icon: Boxes -> Building2 (frees Boxes for Models Coordinated)

CV (cross-reference update):
- Key Highlights section expanded with 3 new bullets matching the new website stats
- Both PDF and DOCX regenerated and copied to public/
</commit_message>
<xml_diff>
--- a/public/Sahal_Alshethri_CV.docx
+++ b/public/Sahal_Alshethri_CV.docx
@@ -54,7 +54,7 @@
         </w:rPr>
         <w:t xml:space="preserve">   |   </w:t>
       </w:r>
-      <w:hyperlink w:history="1" r:id="rIdterpgkqgqt1z-1lf_8exh">
+      <w:hyperlink w:history="1" r:id="rIdffz4zgkd6ycsyjmworylo">
         <w:r>
           <w:rPr>
             <w:rFonts w:ascii="Calibri" w:cs="Calibri" w:eastAsia="Calibri" w:hAnsi="Calibri"/>
@@ -92,7 +92,7 @@
         </w:pBdr>
         <w:spacing w:after="60"/>
       </w:pPr>
-      <w:hyperlink w:history="1" r:id="rIda6dvtomxdg48ndrmk4dku">
+      <w:hyperlink w:history="1" r:id="rId_gqlt9jg7l1fcdvoyz1yb">
         <w:r>
           <w:rPr>
             <w:rFonts w:ascii="Calibri" w:cs="Calibri" w:eastAsia="Calibri" w:hAnsi="Calibri"/>
@@ -113,7 +113,7 @@
         </w:rPr>
         <w:t xml:space="preserve">   |   </w:t>
       </w:r>
-      <w:hyperlink w:history="1" r:id="rIdkjdsojpivhtt_lptkped1">
+      <w:hyperlink w:history="1" r:id="rIdachlmz27qd4qis2wznmsd">
         <w:r>
           <w:rPr>
             <w:rFonts w:ascii="Calibri" w:cs="Calibri" w:eastAsia="Calibri" w:hAnsi="Calibri"/>
@@ -250,7 +250,53 @@
           <w:sz w:val="21"/>
           <w:szCs w:val="21"/>
         </w:rPr>
-        <w:t xml:space="preserve">Owner of asset register, COBie deliverables and asset information workflows on multimillion m² infrastructure programmes.</w:t>
+        <w:t xml:space="preserve">Prepared 70+ asset register and COBie register files for infrastructure programmes, owning data integrity from design through handover.</w:t>
+      </w:r>
+    </w:p>
+    <w:p>
+      <w:pPr>
+        <w:pStyle w:val="ListParagraph"/>
+        <w:numPr>
+          <w:ilvl w:val="0"/>
+          <w:numId w:val="2"/>
+        </w:numPr>
+        <w:spacing w:after="30" w:before="30" w:line="280"/>
+      </w:pPr>
+      <w:r>
+        <w:rPr>
+          <w:rFonts w:ascii="Calibri" w:cs="Calibri" w:eastAsia="Calibri" w:hAnsi="Calibri"/>
+          <w:b w:val="false"/>
+          <w:bCs w:val="false"/>
+          <w:i w:val="false"/>
+          <w:iCs w:val="false"/>
+          <w:color w:val="1F2937"/>
+          <w:sz w:val="21"/>
+          <w:szCs w:val="21"/>
+        </w:rPr>
+        <w:t xml:space="preserve">Coordinated 75+ multidisciplinary BIM models across architectural, civil, MEP and landscape disciplines.</w:t>
+      </w:r>
+    </w:p>
+    <w:p>
+      <w:pPr>
+        <w:pStyle w:val="ListParagraph"/>
+        <w:numPr>
+          <w:ilvl w:val="0"/>
+          <w:numId w:val="2"/>
+        </w:numPr>
+        <w:spacing w:after="30" w:before="30" w:line="280"/>
+      </w:pPr>
+      <w:r>
+        <w:rPr>
+          <w:rFonts w:ascii="Calibri" w:cs="Calibri" w:eastAsia="Calibri" w:hAnsi="Calibri"/>
+          <w:b w:val="false"/>
+          <w:bCs w:val="false"/>
+          <w:i w:val="false"/>
+          <w:iCs w:val="false"/>
+          <w:color w:val="1F2937"/>
+          <w:sz w:val="21"/>
+          <w:szCs w:val="21"/>
+        </w:rPr>
+        <w:t xml:space="preserve">Delivered 30+ IFC and shop drawing packages supporting construction and project delivery teams.</w:t>
       </w:r>
     </w:p>
     <w:p>

</xml_diff>

<commit_message>
Skills: add Revizto to Software; refresh Professional card with new 7 items
Software card:
- Added Revizto (after Navisworks)
- Final list: AutoCAD, Civil 3D, Revit, Navisworks, Revizto, 3Ds Max,
  V-Ray, Lumion, Aconex

Professional card (replaced all 7 items):
- BIM Coordination, Infrastructure Delivery, Asset Information,
  Shop Drawings, Model Federation, Model Integration, Design Documentation

Cross-reference CV update:
- 'BIM & Engineering Discipline' line in CV refreshed to include the new
  terms (model federation, design documentation, infrastructure delivery,
  asset information management) so website and CV stay aligned
- PDF + DOCX regenerated and copied to public/
</commit_message>
<xml_diff>
--- a/public/Sahal_Alshethri_CV.docx
+++ b/public/Sahal_Alshethri_CV.docx
@@ -54,7 +54,7 @@
         </w:rPr>
         <w:t xml:space="preserve">   |   </w:t>
       </w:r>
-      <w:hyperlink w:history="1" r:id="rIdffz4zgkd6ycsyjmworylo">
+      <w:hyperlink w:history="1" r:id="rIdixdmo6ei1yf7zdzrsokhw">
         <w:r>
           <w:rPr>
             <w:rFonts w:ascii="Calibri" w:cs="Calibri" w:eastAsia="Calibri" w:hAnsi="Calibri"/>
@@ -92,7 +92,7 @@
         </w:pBdr>
         <w:spacing w:after="60"/>
       </w:pPr>
-      <w:hyperlink w:history="1" r:id="rId_gqlt9jg7l1fcdvoyz1yb">
+      <w:hyperlink w:history="1" r:id="rIdm-stm_fickoi-kwhaaw3f">
         <w:r>
           <w:rPr>
             <w:rFonts w:ascii="Calibri" w:cs="Calibri" w:eastAsia="Calibri" w:hAnsi="Calibri"/>
@@ -113,7 +113,7 @@
         </w:rPr>
         <w:t xml:space="preserve">   |   </w:t>
       </w:r>
-      <w:hyperlink w:history="1" r:id="rIdachlmz27qd4qis2wznmsd">
+      <w:hyperlink w:history="1" r:id="rIdfqim6gyx_isdu38winkhu">
         <w:r>
           <w:rPr>
             <w:rFonts w:ascii="Calibri" w:cs="Calibri" w:eastAsia="Calibri" w:hAnsi="Calibri"/>
@@ -1225,7 +1225,7 @@
           <w:sz w:val="21"/>
           <w:szCs w:val="21"/>
         </w:rPr>
-        <w:t xml:space="preserve">Multidisciplinary BIM coordination, model integration, clash detection, shop drawings, asset register management, COBie workflows, IFC drawing production, infrastructure &amp; landscape systems, design engineering, 3D modelling, rendering.</w:t>
+        <w:t xml:space="preserve">BIM coordination, infrastructure delivery, asset information management, shop drawings, model federation, model integration, clash detection, design documentation, COBie workflows, IFC drawing production, infrastructure &amp; landscape systems, 3D modelling, rendering.</w:t>
       </w:r>
     </w:p>
     <w:p>

</xml_diff>

<commit_message>
Remove phone number from all touchpoints
- Contact section: removed Phone card (grid: 3-col -> 2-col, max-w-4xl -> 2xl)
- Footer: removed phone icon link
- index.html JSON-LD: removed telephone field from Person schema
- App.tsx: removed unused Phone icon import
- CV (PDF + DOCX): removed PHONE constant + header reference
- Both CV files in public/ regenerated and updated
</commit_message>
<xml_diff>
--- a/public/Sahal_Alshethri_CV.docx
+++ b/public/Sahal_Alshethri_CV.docx
@@ -36,25 +36,7 @@
       <w:pPr>
         <w:spacing w:after="40"/>
       </w:pPr>
-      <w:r>
-        <w:rPr>
-          <w:rFonts w:ascii="Calibri" w:cs="Calibri" w:eastAsia="Calibri" w:hAnsi="Calibri"/>
-          <w:color w:val="4B5563"/>
-          <w:sz w:val="20"/>
-          <w:szCs w:val="20"/>
-        </w:rPr>
-        <w:t xml:space="preserve">+966 53 104 0088</w:t>
-      </w:r>
-      <w:r>
-        <w:rPr>
-          <w:rFonts w:ascii="Calibri" w:cs="Calibri" w:eastAsia="Calibri" w:hAnsi="Calibri"/>
-          <w:color w:val="9CA3AF"/>
-          <w:sz w:val="20"/>
-          <w:szCs w:val="20"/>
-        </w:rPr>
-        <w:t xml:space="preserve">   |   </w:t>
-      </w:r>
-      <w:hyperlink w:history="1" r:id="rIdixdmo6ei1yf7zdzrsokhw">
+      <w:hyperlink w:history="1" r:id="rIdespsgm7zqwxgvpqsss0ex">
         <w:r>
           <w:rPr>
             <w:rFonts w:ascii="Calibri" w:cs="Calibri" w:eastAsia="Calibri" w:hAnsi="Calibri"/>
@@ -92,7 +74,7 @@
         </w:pBdr>
         <w:spacing w:after="60"/>
       </w:pPr>
-      <w:hyperlink w:history="1" r:id="rIdm-stm_fickoi-kwhaaw3f">
+      <w:hyperlink w:history="1" r:id="rIdr4jydiz1mgbrnxlhyuiu8">
         <w:r>
           <w:rPr>
             <w:rFonts w:ascii="Calibri" w:cs="Calibri" w:eastAsia="Calibri" w:hAnsi="Calibri"/>
@@ -113,7 +95,7 @@
         </w:rPr>
         <w:t xml:space="preserve">   |   </w:t>
       </w:r>
-      <w:hyperlink w:history="1" r:id="rIdfqim6gyx_isdu38winkhu">
+      <w:hyperlink w:history="1" r:id="rIdu-7idocs3heeqzhclnzbp">
         <w:r>
           <w:rPr>
             <w:rFonts w:ascii="Calibri" w:cs="Calibri" w:eastAsia="Calibri" w:hAnsi="Calibri"/>

</xml_diff>

<commit_message>
CV: restore phone, drop LinkedIn URL + website URL from header
- Phone restored to the contact row (kept off the website but visible on CV)
- LinkedIn URL removed (was in row 2 of header)
- Portfolio URL (sahalalshethri.com) removed (was in row 2 of header)
- PDF metadata Creator field changed from 'sahalalshethri.com' -> 'Sahal Alshethri'
- Header is now a single contact row: Phone | Email | Location
</commit_message>
<xml_diff>
--- a/public/Sahal_Alshethri_CV.docx
+++ b/public/Sahal_Alshethri_CV.docx
@@ -34,9 +34,30 @@
     </w:p>
     <w:p>
       <w:pPr>
-        <w:spacing w:after="40"/>
-      </w:pPr>
-      <w:hyperlink w:history="1" r:id="rIdespsgm7zqwxgvpqsss0ex">
+        <w:pBdr>
+          <w:bottom w:val="single" w:color="D1D5DB" w:sz="6" w:space="6"/>
+        </w:pBdr>
+        <w:spacing w:after="60"/>
+      </w:pPr>
+      <w:r>
+        <w:rPr>
+          <w:rFonts w:ascii="Calibri" w:cs="Calibri" w:eastAsia="Calibri" w:hAnsi="Calibri"/>
+          <w:color w:val="4B5563"/>
+          <w:sz w:val="20"/>
+          <w:szCs w:val="20"/>
+        </w:rPr>
+        <w:t xml:space="preserve">+966 53 104 0088</w:t>
+      </w:r>
+      <w:r>
+        <w:rPr>
+          <w:rFonts w:ascii="Calibri" w:cs="Calibri" w:eastAsia="Calibri" w:hAnsi="Calibri"/>
+          <w:color w:val="9CA3AF"/>
+          <w:sz w:val="20"/>
+          <w:szCs w:val="20"/>
+        </w:rPr>
+        <w:t xml:space="preserve">   |   </w:t>
+      </w:r>
+      <w:hyperlink w:history="1" r:id="rIdrnsbdk4yl65u5wgieprn_">
         <w:r>
           <w:rPr>
             <w:rFonts w:ascii="Calibri" w:cs="Calibri" w:eastAsia="Calibri" w:hAnsi="Calibri"/>
@@ -66,47 +87,6 @@
         </w:rPr>
         <w:t xml:space="preserve">Riyadh, Saudi Arabia</w:t>
       </w:r>
-    </w:p>
-    <w:p>
-      <w:pPr>
-        <w:pBdr>
-          <w:bottom w:val="single" w:color="D1D5DB" w:sz="6" w:space="6"/>
-        </w:pBdr>
-        <w:spacing w:after="60"/>
-      </w:pPr>
-      <w:hyperlink w:history="1" r:id="rIdr4jydiz1mgbrnxlhyuiu8">
-        <w:r>
-          <w:rPr>
-            <w:rFonts w:ascii="Calibri" w:cs="Calibri" w:eastAsia="Calibri" w:hAnsi="Calibri"/>
-            <w:color w:val="1D4ED8"/>
-            <w:sz w:val="20"/>
-            <w:szCs w:val="20"/>
-            <w:u w:val="single"/>
-          </w:rPr>
-          <w:t xml:space="preserve">linkedin.com/in/sahal-alshethri-599186183</w:t>
-        </w:r>
-      </w:hyperlink>
-      <w:r>
-        <w:rPr>
-          <w:rFonts w:ascii="Calibri" w:cs="Calibri" w:eastAsia="Calibri" w:hAnsi="Calibri"/>
-          <w:color w:val="9CA3AF"/>
-          <w:sz w:val="20"/>
-          <w:szCs w:val="20"/>
-        </w:rPr>
-        <w:t xml:space="preserve">   |   </w:t>
-      </w:r>
-      <w:hyperlink w:history="1" r:id="rIdu-7idocs3heeqzhclnzbp">
-        <w:r>
-          <w:rPr>
-            <w:rFonts w:ascii="Calibri" w:cs="Calibri" w:eastAsia="Calibri" w:hAnsi="Calibri"/>
-            <w:color w:val="1D4ED8"/>
-            <w:sz w:val="20"/>
-            <w:szCs w:val="20"/>
-            <w:u w:val="single"/>
-          </w:rPr>
-          <w:t xml:space="preserve">sahalalshethri.com</w:t>
-        </w:r>
-      </w:hyperlink>
     </w:p>
     <w:p>
       <w:pPr>

</xml_diff>